<commit_message>
Add SDD and project updates
</commit_message>
<xml_diff>
--- a/SENG-384_SDD.docx
+++ b/SENG-384_SDD.docx
@@ -18189,6 +18189,9 @@
         <w:spacing w:before="80"/>
       </w:pPr>
       <w:r>
+        <w:rPr>
+          <w:noProof/>
+        </w:rPr>
         <w:drawing>
           <wp:inline distT="0" distB="0" distL="0" distR="0" wp14:anchorId="2669A765" wp14:editId="03EF7601">
             <wp:extent cx="6286500" cy="3028950"/>
@@ -18241,6 +18244,9 @@
         <w:spacing w:before="80"/>
       </w:pPr>
       <w:r>
+        <w:rPr>
+          <w:noProof/>
+        </w:rPr>
         <w:drawing>
           <wp:inline distT="0" distB="0" distL="0" distR="0" wp14:anchorId="535AC1D5" wp14:editId="2FDB3E9D">
             <wp:extent cx="6286500" cy="3020695"/>
@@ -18288,6 +18294,9 @@
         <w:spacing w:before="80"/>
       </w:pPr>
       <w:r>
+        <w:rPr>
+          <w:noProof/>
+        </w:rPr>
         <w:drawing>
           <wp:inline distT="0" distB="0" distL="0" distR="0" wp14:anchorId="7B42F208" wp14:editId="142A09C8">
             <wp:extent cx="6286500" cy="3043555"/>
@@ -18335,6 +18344,9 @@
         <w:spacing w:before="80"/>
       </w:pPr>
       <w:r>
+        <w:rPr>
+          <w:noProof/>
+        </w:rPr>
         <w:drawing>
           <wp:inline distT="0" distB="0" distL="0" distR="0" wp14:anchorId="770B677A" wp14:editId="3D8B6F9C">
             <wp:extent cx="6286500" cy="3015615"/>
@@ -21045,7 +21057,42 @@
                 <w:sz w:val="18"/>
                 <w:szCs w:val="18"/>
               </w:rPr>
-              <w:t>§3.1, §5.1, §7</w:t>
+              <w:t>S</w:t>
+            </w:r>
+            <w:r>
+              <w:rPr>
+                <w:sz w:val="18"/>
+                <w:szCs w:val="18"/>
+              </w:rPr>
+              <w:t xml:space="preserve">3.1, </w:t>
+            </w:r>
+            <w:r>
+              <w:rPr>
+                <w:sz w:val="18"/>
+                <w:szCs w:val="18"/>
+              </w:rPr>
+              <w:t>S</w:t>
+            </w:r>
+            <w:r>
+              <w:rPr>
+                <w:sz w:val="18"/>
+                <w:szCs w:val="18"/>
+              </w:rPr>
+              <w:t xml:space="preserve">5.1, </w:t>
+            </w:r>
+            <w:r>
+              <w:rPr>
+                <w:sz w:val="18"/>
+                <w:szCs w:val="18"/>
+              </w:rPr>
+              <w:t>S</w:t>
+            </w:r>
+            <w:r>
+              <w:rPr>
+                <w:sz w:val="18"/>
+                <w:szCs w:val="18"/>
+              </w:rPr>
+              <w:t>7</w:t>
             </w:r>
           </w:p>
         </w:tc>
@@ -21155,7 +21202,28 @@
                 <w:sz w:val="18"/>
                 <w:szCs w:val="18"/>
               </w:rPr>
-              <w:t>§3.1, §5.1</w:t>
+              <w:t>S</w:t>
+            </w:r>
+            <w:r>
+              <w:rPr>
+                <w:sz w:val="18"/>
+                <w:szCs w:val="18"/>
+              </w:rPr>
+              <w:t xml:space="preserve">3.1, </w:t>
+            </w:r>
+            <w:r>
+              <w:rPr>
+                <w:sz w:val="18"/>
+                <w:szCs w:val="18"/>
+              </w:rPr>
+              <w:t>S</w:t>
+            </w:r>
+            <w:r>
+              <w:rPr>
+                <w:sz w:val="18"/>
+                <w:szCs w:val="18"/>
+              </w:rPr>
+              <w:t>5.1</w:t>
             </w:r>
           </w:p>
         </w:tc>
@@ -21265,7 +21333,42 @@
                 <w:sz w:val="18"/>
                 <w:szCs w:val="18"/>
               </w:rPr>
-              <w:t>§3.1, §4.2.1, §5.1</w:t>
+              <w:t>S</w:t>
+            </w:r>
+            <w:r>
+              <w:rPr>
+                <w:sz w:val="18"/>
+                <w:szCs w:val="18"/>
+              </w:rPr>
+              <w:t xml:space="preserve">3.1, </w:t>
+            </w:r>
+            <w:r>
+              <w:rPr>
+                <w:sz w:val="18"/>
+                <w:szCs w:val="18"/>
+              </w:rPr>
+              <w:t>S</w:t>
+            </w:r>
+            <w:r>
+              <w:rPr>
+                <w:sz w:val="18"/>
+                <w:szCs w:val="18"/>
+              </w:rPr>
+              <w:t xml:space="preserve">4.2.1, </w:t>
+            </w:r>
+            <w:r>
+              <w:rPr>
+                <w:sz w:val="18"/>
+                <w:szCs w:val="18"/>
+              </w:rPr>
+              <w:t>S</w:t>
+            </w:r>
+            <w:r>
+              <w:rPr>
+                <w:sz w:val="18"/>
+                <w:szCs w:val="18"/>
+              </w:rPr>
+              <w:t>5.1</w:t>
             </w:r>
           </w:p>
         </w:tc>
@@ -21375,7 +21478,28 @@
                 <w:sz w:val="18"/>
                 <w:szCs w:val="18"/>
               </w:rPr>
-              <w:t>§3.1, §4.2.1</w:t>
+              <w:t>S</w:t>
+            </w:r>
+            <w:r>
+              <w:rPr>
+                <w:sz w:val="18"/>
+                <w:szCs w:val="18"/>
+              </w:rPr>
+              <w:t xml:space="preserve">3.1, </w:t>
+            </w:r>
+            <w:r>
+              <w:rPr>
+                <w:sz w:val="18"/>
+                <w:szCs w:val="18"/>
+              </w:rPr>
+              <w:t>S</w:t>
+            </w:r>
+            <w:r>
+              <w:rPr>
+                <w:sz w:val="18"/>
+                <w:szCs w:val="18"/>
+              </w:rPr>
+              <w:t>4.2.1</w:t>
             </w:r>
           </w:p>
         </w:tc>
@@ -21485,7 +21609,28 @@
                 <w:sz w:val="18"/>
                 <w:szCs w:val="18"/>
               </w:rPr>
-              <w:t>§3.1, §7</w:t>
+              <w:t>S</w:t>
+            </w:r>
+            <w:r>
+              <w:rPr>
+                <w:sz w:val="18"/>
+                <w:szCs w:val="18"/>
+              </w:rPr>
+              <w:t xml:space="preserve">3.1, </w:t>
+            </w:r>
+            <w:r>
+              <w:rPr>
+                <w:sz w:val="18"/>
+                <w:szCs w:val="18"/>
+              </w:rPr>
+              <w:t>S</w:t>
+            </w:r>
+            <w:r>
+              <w:rPr>
+                <w:sz w:val="18"/>
+                <w:szCs w:val="18"/>
+              </w:rPr>
+              <w:t>7</w:t>
             </w:r>
           </w:p>
         </w:tc>

</xml_diff>